<commit_message>
fix: correct malformed sectPr position in chapter-4.docx
html-to-docx placed <w:sectPr> as the first child of <w:body>, but the
OOXML WordprocessingML schema requires a body-level sectPr to be the
LAST element in the body (it defines the final section's page
setup). Word's strict validator rejected the file outright ("cannot
open content") even though it was a well-formed zip/XML otherwise —
looser tools didn't care about the ordering, which is why it looked
fine on inspection. Patched the packaged document.xml directly to move
sectPr to the end of the body and repackaged the .docx. Verified the
XML is still well-formed and that an independent library (mammoth,
unrelated to the one that generated the file) parses it back out
cleanly with zero warnings.

Co-Authored-By: Claude Sonnet 5 <noreply@anthropic.com>
</commit_message>
<xml_diff>
--- a/docs/final-year-project/chapter-4.docx
+++ b/docs/final-year-project/chapter-4.docx
@@ -2,10 +2,6 @@
 <file path=word/document.xml><?xml version="1.0" encoding="utf-8"?>
 <w:document xmlns:a="http://schemas.openxmlformats.org/drawingml/2006/main" xmlns:cdr="http://schemas.openxmlformats.org/drawingml/2006/chartDrawing" xmlns:o="urn:schemas-microsoft-com:office:office" xmlns:pic="http://schemas.openxmlformats.org/drawingml/2006/picture" xmlns:r="http://schemas.openxmlformats.org/officeDocument/2006/relationships" xmlns:v="urn:schemas-microsoft-com:vml" xmlns:ve="http://schemas.openxmlformats.org/markup-compatibility/2006" xmlns:vt="http://schemas.openxmlformats.org/officeDocument/2006/docPropsVTypes" xmlns:w="http://schemas.openxmlformats.org/wordprocessingml/2006/main" xmlns:w10="urn:schemas-microsoft-com:office:word" xmlns:wp="http://schemas.openxmlformats.org/drawingml/2006/wordprocessingDrawing" xmlns:wne="http://schemas.microsoft.com/office/word/2006/wordml">
   <w:body>
-    <w:sectPr>
-      <w:pgSz w:w="12240" w:h="15840" w:orient="portrait"/>
-      <w:pgMar w:top="1440" w:right="1800" w:bottom="1440" w:left="1800" w:header="720" w:footer="720" w:gutter="0"/>
-    </w:sectPr>
     <w:p>
       <w:pPr>
         <w:spacing w:lineRule="auto"/>
@@ -4894,6 +4890,10 @@
         <w:t xml:space="preserve">This chapter described the environment and tools used to implement the Face Authentication Examination Attendance System, walked through each of its modules — administrative management of the academic structure, bulk student onboarding, the six-step student self-onboarding wizard, the invigilator mobile application, and the face-matching microservice underlying attendance verification — with supporting screenshots, and presented the strategy and outcome of testing the system, including 62 automated tests covering every major workflow and manual end-to-end verification of the complete system across all three of its constituent applications. The results confirm that the system behaves correctly both in isolated unit-level scenarios and in realistic, full end-to-end usage, and the chapter documented the concrete engineering trade-offs made in response to real constraints encountered during development.</w:t>
       </w:r>
     </w:p>
+    <w:sectPr>
+      <w:pgSz w:w="12240" w:h="15840" w:orient="portrait"/>
+      <w:pgMar w:top="1440" w:right="1800" w:bottom="1440" w:left="1800" w:header="720" w:footer="720" w:gutter="0"/>
+    </w:sectPr>
   </w:body>
 </w:document>
 </file>

</xml_diff>

<commit_message>
fix: bake the sectPr repositioning fix into convert.js itself
The previous commit patched the already-generated chapter-4.docx by
hand. This moves that fix into convert.js (using adm-zip to repackage
the .docx after html-to-docx generates it), so regenerating the file
after future edits to chapter-4.md doesn't quietly reintroduce the
same "cannot open content" bug. Regenerated chapter-4.docx through the
fixed script and re-verified with mammoth (zero warnings).

Co-Authored-By: Claude Sonnet 5 <noreply@anthropic.com>
</commit_message>
<xml_diff>
--- a/docs/final-year-project/chapter-4.docx
+++ b/docs/final-year-project/chapter-4.docx
@@ -1277,12 +1277,12 @@
           <wp:inline distB="0" distL="0" distR="0" distT="0">
             <wp:extent/>
             <wp:effectExtent b="0" l="0" r="0" t="0"/>
-            <wp:docPr id="1" name="image-dQxmItgvJrZAcUNc_vcjG.png"/>
+            <wp:docPr id="1" name="image-F-CHQBjO9Oph4NmMfmBDT.png"/>
             <a:graphic>
               <a:graphicData uri="http://schemas.openxmlformats.org/drawingml/2006/picture">
                 <pic:pic>
                   <pic:nvPicPr>
-                    <pic:cNvPr id="1" name="image-dQxmItgvJrZAcUNc_vcjG.png" descr="Welcome page"/>
+                    <pic:cNvPr id="1" name="image-F-CHQBjO9Oph4NmMfmBDT.png" descr="Welcome page"/>
                     <pic:cNvPicPr/>
                   </pic:nvPicPr>
                   <pic:blipFill>
@@ -1345,12 +1345,12 @@
           <wp:inline distB="0" distL="0" distR="0" distT="0">
             <wp:extent/>
             <wp:effectExtent b="0" l="0" r="0" t="0"/>
-            <wp:docPr id="2" name="image-Zm2dyF4fC4Ji2nUeFHE5N.png"/>
+            <wp:docPr id="2" name="image-x1mW7PzdcB_JPSgp1gMUT.png"/>
             <a:graphic>
               <a:graphicData uri="http://schemas.openxmlformats.org/drawingml/2006/picture">
                 <pic:pic>
                   <pic:nvPicPr>
-                    <pic:cNvPr id="2" name="image-Zm2dyF4fC4Ji2nUeFHE5N.png" descr="Admin login"/>
+                    <pic:cNvPr id="2" name="image-x1mW7PzdcB_JPSgp1gMUT.png" descr="Admin login"/>
                     <pic:cNvPicPr/>
                   </pic:nvPicPr>
                   <pic:blipFill>
@@ -1413,12 +1413,12 @@
           <wp:inline distB="0" distL="0" distR="0" distT="0">
             <wp:extent/>
             <wp:effectExtent b="0" l="0" r="0" t="0"/>
-            <wp:docPr id="3" name="image-xjne7mJpzEZwhBbxH52S7.png"/>
+            <wp:docPr id="3" name="image-Pc67v9bUn2Fpr7VY7w-ju.png"/>
             <a:graphic>
               <a:graphicData uri="http://schemas.openxmlformats.org/drawingml/2006/picture">
                 <pic:pic>
                   <pic:nvPicPr>
-                    <pic:cNvPr id="3" name="image-xjne7mJpzEZwhBbxH52S7.png" descr="Admin dashboard"/>
+                    <pic:cNvPr id="3" name="image-Pc67v9bUn2Fpr7VY7w-ju.png" descr="Admin dashboard"/>
                     <pic:cNvPicPr/>
                   </pic:nvPicPr>
                   <pic:blipFill>
@@ -1539,12 +1539,12 @@
           <wp:inline distB="0" distL="0" distR="0" distT="0">
             <wp:extent/>
             <wp:effectExtent b="0" l="0" r="0" t="0"/>
-            <wp:docPr id="4" name="image-a6HZunlu3uHoYkD3o2IM2.png"/>
+            <wp:docPr id="4" name="image-BvvEu9YyviYQy9EgJSV-y.png"/>
             <a:graphic>
               <a:graphicData uri="http://schemas.openxmlformats.org/drawingml/2006/picture">
                 <pic:pic>
                   <pic:nvPicPr>
-                    <pic:cNvPr id="4" name="image-a6HZunlu3uHoYkD3o2IM2.png" descr="Schools"/>
+                    <pic:cNvPr id="4" name="image-BvvEu9YyviYQy9EgJSV-y.png" descr="Schools"/>
                     <pic:cNvPicPr/>
                   </pic:nvPicPr>
                   <pic:blipFill>
@@ -1588,12 +1588,12 @@
           <wp:inline distB="0" distL="0" distR="0" distT="0">
             <wp:extent/>
             <wp:effectExtent b="0" l="0" r="0" t="0"/>
-            <wp:docPr id="5" name="image-h91gWi2dymdpCGuP7BwOp.png"/>
+            <wp:docPr id="5" name="image-LsYhybbpovFhO0UgG1-0z.png"/>
             <a:graphic>
               <a:graphicData uri="http://schemas.openxmlformats.org/drawingml/2006/picture">
                 <pic:pic>
                   <pic:nvPicPr>
-                    <pic:cNvPr id="5" name="image-h91gWi2dymdpCGuP7BwOp.png" descr="Departments"/>
+                    <pic:cNvPr id="5" name="image-LsYhybbpovFhO0UgG1-0z.png" descr="Departments"/>
                     <pic:cNvPicPr/>
                   </pic:nvPicPr>
                   <pic:blipFill>
@@ -1637,12 +1637,12 @@
           <wp:inline distB="0" distL="0" distR="0" distT="0">
             <wp:extent/>
             <wp:effectExtent b="0" l="0" r="0" t="0"/>
-            <wp:docPr id="6" name="image-3qJFVNCycCJr7nPNRRVz-.png"/>
+            <wp:docPr id="6" name="image-37fuBTTMhvq7FwJuCaViz.png"/>
             <a:graphic>
               <a:graphicData uri="http://schemas.openxmlformats.org/drawingml/2006/picture">
                 <pic:pic>
                   <pic:nvPicPr>
-                    <pic:cNvPr id="6" name="image-3qJFVNCycCJr7nPNRRVz-.png" descr="Courses"/>
+                    <pic:cNvPr id="6" name="image-37fuBTTMhvq7FwJuCaViz.png" descr="Courses"/>
                     <pic:cNvPicPr/>
                   </pic:nvPicPr>
                   <pic:blipFill>
@@ -1723,12 +1723,12 @@
           <wp:inline distB="0" distL="0" distR="0" distT="0">
             <wp:extent/>
             <wp:effectExtent b="0" l="0" r="0" t="0"/>
-            <wp:docPr id="7" name="image-eUse2-lmlEl5KqwMJx8m2.png"/>
+            <wp:docPr id="7" name="image-UPAxRm69lBT5oTgAogwn4.png"/>
             <a:graphic>
               <a:graphicData uri="http://schemas.openxmlformats.org/drawingml/2006/picture">
                 <pic:pic>
                   <pic:nvPicPr>
-                    <pic:cNvPr id="7" name="image-eUse2-lmlEl5KqwMJx8m2.png" descr="Students"/>
+                    <pic:cNvPr id="7" name="image-UPAxRm69lBT5oTgAogwn4.png" descr="Students"/>
                     <pic:cNvPicPr/>
                   </pic:nvPicPr>
                   <pic:blipFill>
@@ -1772,12 +1772,12 @@
           <wp:inline distB="0" distL="0" distR="0" distT="0">
             <wp:extent/>
             <wp:effectExtent b="0" l="0" r="0" t="0"/>
-            <wp:docPr id="8" name="image-47xp1eK2qvmzEwPphzSlM.png"/>
+            <wp:docPr id="8" name="image-JCNOs6OglUo7xRkWjv07p.png"/>
             <a:graphic>
               <a:graphicData uri="http://schemas.openxmlformats.org/drawingml/2006/picture">
                 <pic:pic>
                   <pic:nvPicPr>
-                    <pic:cNvPr id="8" name="image-47xp1eK2qvmzEwPphzSlM.png" descr="Bulk import"/>
+                    <pic:cNvPr id="8" name="image-JCNOs6OglUo7xRkWjv07p.png" descr="Bulk import"/>
                     <pic:cNvPicPr/>
                   </pic:nvPicPr>
                   <pic:blipFill>
@@ -1821,12 +1821,12 @@
           <wp:inline distB="0" distL="0" distR="0" distT="0">
             <wp:extent/>
             <wp:effectExtent b="0" l="0" r="0" t="0"/>
-            <wp:docPr id="9" name="image-hR9pnvtQe--afOXiNX161.png"/>
+            <wp:docPr id="9" name="image-Dlyno38BXMIOeqwNxLVY-.png"/>
             <a:graphic>
               <a:graphicData uri="http://schemas.openxmlformats.org/drawingml/2006/picture">
                 <pic:pic>
                   <pic:nvPicPr>
-                    <pic:cNvPr id="9" name="image-hR9pnvtQe--afOXiNX161.png" descr="Invigilators"/>
+                    <pic:cNvPr id="9" name="image-Dlyno38BXMIOeqwNxLVY-.png" descr="Invigilators"/>
                     <pic:cNvPicPr/>
                   </pic:nvPicPr>
                   <pic:blipFill>
@@ -1897,12 +1897,12 @@
           <wp:inline distB="0" distL="0" distR="0" distT="0">
             <wp:extent/>
             <wp:effectExtent b="0" l="0" r="0" t="0"/>
-            <wp:docPr id="10" name="image-cPy59XlVzexIVXw5GHEfH.png"/>
+            <wp:docPr id="10" name="image-i-talgE48r1jdtIaRWAyT.png"/>
             <a:graphic>
               <a:graphicData uri="http://schemas.openxmlformats.org/drawingml/2006/picture">
                 <pic:pic>
                   <pic:nvPicPr>
-                    <pic:cNvPr id="10" name="image-cPy59XlVzexIVXw5GHEfH.png" descr="Student login"/>
+                    <pic:cNvPr id="10" name="image-i-talgE48r1jdtIaRWAyT.png" descr="Student login"/>
                     <pic:cNvPicPr/>
                   </pic:nvPicPr>
                   <pic:blipFill>
@@ -1946,12 +1946,12 @@
           <wp:inline distB="0" distL="0" distR="0" distT="0">
             <wp:extent/>
             <wp:effectExtent b="0" l="0" r="0" t="0"/>
-            <wp:docPr id="11" name="image-n_q4gAfrFQQG1v-5eaJEs.png"/>
+            <wp:docPr id="11" name="image-r4GPHy0_UDv1t9hLbS69m.png"/>
             <a:graphic>
               <a:graphicData uri="http://schemas.openxmlformats.org/drawingml/2006/picture">
                 <pic:pic>
                   <pic:nvPicPr>
-                    <pic:cNvPr id="11" name="image-n_q4gAfrFQQG1v-5eaJEs.png" descr="Password change"/>
+                    <pic:cNvPr id="11" name="image-r4GPHy0_UDv1t9hLbS69m.png" descr="Password change"/>
                     <pic:cNvPicPr/>
                   </pic:nvPicPr>
                   <pic:blipFill>
@@ -2037,12 +2037,12 @@
           <wp:inline distB="0" distL="0" distR="0" distT="0">
             <wp:extent/>
             <wp:effectExtent b="0" l="0" r="0" t="0"/>
-            <wp:docPr id="12" name="image-SovoyRqYVxHytmkbr18Xh.png"/>
+            <wp:docPr id="12" name="image-1SZddSEO83vigBTE9X8G8.png"/>
             <a:graphic>
               <a:graphicData uri="http://schemas.openxmlformats.org/drawingml/2006/picture">
                 <pic:pic>
                   <pic:nvPicPr>
-                    <pic:cNvPr id="12" name="image-SovoyRqYVxHytmkbr18Xh.png" descr="Step 1"/>
+                    <pic:cNvPr id="12" name="image-1SZddSEO83vigBTE9X8G8.png" descr="Step 1"/>
                     <pic:cNvPicPr/>
                   </pic:nvPicPr>
                   <pic:blipFill>
@@ -2101,12 +2101,12 @@
           <wp:inline distB="0" distL="0" distR="0" distT="0">
             <wp:extent/>
             <wp:effectExtent b="0" l="0" r="0" t="0"/>
-            <wp:docPr id="13" name="image-C0k4CBjD2NBZf4ueJsCVz.png"/>
+            <wp:docPr id="13" name="image-a8yc3H2zF_mtLDWet1DPI.png"/>
             <a:graphic>
               <a:graphicData uri="http://schemas.openxmlformats.org/drawingml/2006/picture">
                 <pic:pic>
                   <pic:nvPicPr>
-                    <pic:cNvPr id="13" name="image-C0k4CBjD2NBZf4ueJsCVz.png" descr="Step 2"/>
+                    <pic:cNvPr id="13" name="image-a8yc3H2zF_mtLDWet1DPI.png" descr="Step 2"/>
                     <pic:cNvPicPr/>
                   </pic:nvPicPr>
                   <pic:blipFill>
@@ -2165,12 +2165,12 @@
           <wp:inline distB="0" distL="0" distR="0" distT="0">
             <wp:extent/>
             <wp:effectExtent b="0" l="0" r="0" t="0"/>
-            <wp:docPr id="14" name="image-MHYV0Ie7T8m1uJs4Q3gyE.png"/>
+            <wp:docPr id="14" name="image-JIYp0H44CcUPkdEjUUKSR.png"/>
             <a:graphic>
               <a:graphicData uri="http://schemas.openxmlformats.org/drawingml/2006/picture">
                 <pic:pic>
                   <pic:nvPicPr>
-                    <pic:cNvPr id="14" name="image-MHYV0Ie7T8m1uJs4Q3gyE.png" descr="Step 3"/>
+                    <pic:cNvPr id="14" name="image-JIYp0H44CcUPkdEjUUKSR.png" descr="Step 3"/>
                     <pic:cNvPicPr/>
                   </pic:nvPicPr>
                   <pic:blipFill>
@@ -2247,12 +2247,12 @@
           <wp:inline distB="0" distL="0" distR="0" distT="0">
             <wp:extent/>
             <wp:effectExtent b="0" l="0" r="0" t="0"/>
-            <wp:docPr id="15" name="image-VWT64anxwLnE3NaorwCPJ.png"/>
+            <wp:docPr id="15" name="image-Ypup7DwMq4JhucvnoPR0B.png"/>
             <a:graphic>
               <a:graphicData uri="http://schemas.openxmlformats.org/drawingml/2006/picture">
                 <pic:pic>
                   <pic:nvPicPr>
-                    <pic:cNvPr id="15" name="image-VWT64anxwLnE3NaorwCPJ.png" descr="Step 4"/>
+                    <pic:cNvPr id="15" name="image-Ypup7DwMq4JhucvnoPR0B.png" descr="Step 4"/>
                     <pic:cNvPicPr/>
                   </pic:nvPicPr>
                   <pic:blipFill>
@@ -2311,12 +2311,12 @@
           <wp:inline distB="0" distL="0" distR="0" distT="0">
             <wp:extent/>
             <wp:effectExtent b="0" l="0" r="0" t="0"/>
-            <wp:docPr id="16" name="image-oe6FZVnohKlT8gg-2XThc.png"/>
+            <wp:docPr id="16" name="image-IZk9qzZApzkmbafBu-XkV.png"/>
             <a:graphic>
               <a:graphicData uri="http://schemas.openxmlformats.org/drawingml/2006/picture">
                 <pic:pic>
                   <pic:nvPicPr>
-                    <pic:cNvPr id="16" name="image-oe6FZVnohKlT8gg-2XThc.png" descr="Step 5"/>
+                    <pic:cNvPr id="16" name="image-IZk9qzZApzkmbafBu-XkV.png" descr="Step 5"/>
                     <pic:cNvPicPr/>
                   </pic:nvPicPr>
                   <pic:blipFill>
@@ -2375,12 +2375,12 @@
           <wp:inline distB="0" distL="0" distR="0" distT="0">
             <wp:extent/>
             <wp:effectExtent b="0" l="0" r="0" t="0"/>
-            <wp:docPr id="17" name="image-F9JyeCyNuHnywqiPTcrFC.png"/>
+            <wp:docPr id="17" name="image-QfJOjRua-v3vwkvQln-kN.png"/>
             <a:graphic>
               <a:graphicData uri="http://schemas.openxmlformats.org/drawingml/2006/picture">
                 <pic:pic>
                   <pic:nvPicPr>
-                    <pic:cNvPr id="17" name="image-F9JyeCyNuHnywqiPTcrFC.png" descr="Step 6"/>
+                    <pic:cNvPr id="17" name="image-QfJOjRua-v3vwkvQln-kN.png" descr="Step 6"/>
                     <pic:cNvPicPr/>
                   </pic:nvPicPr>
                   <pic:blipFill>
@@ -2443,12 +2443,12 @@
           <wp:inline distB="0" distL="0" distR="0" distT="0">
             <wp:extent/>
             <wp:effectExtent b="0" l="0" r="0" t="0"/>
-            <wp:docPr id="18" name="image--s_m6crh7eFUdmRpMjCIZ.png"/>
+            <wp:docPr id="18" name="image-tl9x18qfMNecszlYexwo7.png"/>
             <a:graphic>
               <a:graphicData uri="http://schemas.openxmlformats.org/drawingml/2006/picture">
                 <pic:pic>
                   <pic:nvPicPr>
-                    <pic:cNvPr id="18" name="image--s_m6crh7eFUdmRpMjCIZ.png" descr="Student dashboard"/>
+                    <pic:cNvPr id="18" name="image-tl9x18qfMNecszlYexwo7.png" descr="Student dashboard"/>
                     <pic:cNvPicPr/>
                   </pic:nvPicPr>
                   <pic:blipFill>

</xml_diff>